<commit_message>
Enhance appointment management by introducing unload team functionality. Update appointment creation and scheduling logic to accommodate multiple unload teams, ensuring proper conflict checks and capacity management. Modify related models, schemas, and services to support the new unload team feature, including adjustments to database constraints and API endpoints for better handling of appointments and warehouse operations.
</commit_message>
<xml_diff>
--- a/docs/ESPECIFICACION_REQUISITOS_IEEE830_FERRAGRO.docx
+++ b/docs/ESPECIFICACION_REQUISITOS_IEEE830_FERRAGRO.docx
@@ -32,7 +32,7 @@
         <w:jc w:val="center"/>
       </w:pPr>
       <w:r>
-        <w:t>Versión del documento: 1.0</w:t>
+        <w:t>Versión del documento: 1.1</w:t>
       </w:r>
     </w:p>
     <w:p>
@@ -40,7 +40,7 @@
         <w:jc w:val="center"/>
       </w:pPr>
       <w:r>
-        <w:t>Fecha: 19/05/2026</w:t>
+        <w:t>Fecha: 21/05/2026</w:t>
       </w:r>
     </w:p>
     <w:p>
@@ -188,7 +188,15 @@
         <w:pStyle w:val="ListBullet"/>
       </w:pPr>
       <w:r>
-        <w:t>Cita: Reserva de una ventana horaria para entrega de material en instalaciones Ferragro.</w:t>
+        <w:t>Bodega: Lugar de entrega (almacén/punto logístico) donde se agenda la cita; define franjas y conflictos horarios.</w:t>
+      </w:r>
+    </w:p>
+    <w:p>
+      <w:pPr>
+        <w:pStyle w:val="ListBullet"/>
+      </w:pPr>
+      <w:r>
+        <w:t>Cita: Reserva de una ventana horaria para entrega de material en una bodega Ferragro.</w:t>
       </w:r>
     </w:p>
     <w:p>
@@ -342,7 +350,7 @@
         <w:pStyle w:val="ListBullet"/>
       </w:pPr>
       <w:r>
-        <w:t>Configuración de franjas horarias por día y calendario operativo (zona America/Bogota).</w:t>
+        <w:t>Gestión de bodegas (lugares de entrega) y franjas horarias por bodega y calendario (zona America/Bogota).</w:t>
       </w:r>
     </w:p>
     <w:p>
@@ -515,6 +523,22 @@
         <w:pStyle w:val="ListBullet"/>
       </w:pPr>
       <w:r>
+        <w:t>Toda cita debe asociarse a una bodega activa (IdBodega obligatorio).</w:t>
+      </w:r>
+    </w:p>
+    <w:p>
+      <w:pPr>
+        <w:pStyle w:val="ListBullet"/>
+      </w:pPr>
+      <w:r>
+        <w:t>Conflictos de horario se evalúan por bodega: dos citas no pueden solaparse en la misma bodega y ventana.</w:t>
+      </w:r>
+    </w:p>
+    <w:p>
+      <w:pPr>
+        <w:pStyle w:val="ListBullet"/>
+      </w:pPr>
+      <w:r>
         <w:t>Producción debe operar bajo HTTPS; cookies de actualización seguras en entorno productivo.</w:t>
       </w:r>
     </w:p>
@@ -1368,7 +1392,7 @@
         <w:pStyle w:val="ListBullet"/>
       </w:pPr>
       <w:r>
-        <w:t>Descripción: El proveedor crea una cita indicando material, fecha/hora de inicio y duración. El sistema valida anticipación mínima, franja permitida y ausencia de conflicto horario.</w:t>
+        <w:t>Descripción: El proveedor crea una cita indicando bodega, material, fecha/hora de inicio y duración. El sistema valida anticipación mínima, franja permitida en esa bodega y ausencia de conflicto horario en la bodega.</w:t>
       </w:r>
     </w:p>
     <w:p>
@@ -1384,7 +1408,7 @@
         <w:pStyle w:val="Heading3"/>
       </w:pPr>
       <w:r>
-        <w:t>RF-020: Consulta de citas por proveedor</w:t>
+        <w:t>RF-020: Gestión de bodegas</w:t>
       </w:r>
     </w:p>
     <w:p>
@@ -1400,6 +1424,46 @@
         <w:pStyle w:val="ListBullet"/>
       </w:pPr>
       <w:r>
+        <w:t>Actores: Admin</w:t>
+      </w:r>
+    </w:p>
+    <w:p>
+      <w:pPr>
+        <w:pStyle w:val="ListBullet"/>
+      </w:pPr>
+      <w:r>
+        <w:t>Descripción: Admin define bodegas (nombre, dirección, activa/inactiva, orden). Las citas y franjas se asocian a una bodega.</w:t>
+      </w:r>
+    </w:p>
+    <w:p>
+      <w:pPr>
+        <w:pStyle w:val="ListBullet"/>
+      </w:pPr>
+      <w:r>
+        <w:t>Procesamiento: Validación en API, persistencia en PostgreSQL, respuesta JSON estándar.</w:t>
+      </w:r>
+    </w:p>
+    <w:p>
+      <w:pPr>
+        <w:pStyle w:val="Heading3"/>
+      </w:pPr>
+      <w:r>
+        <w:t>RF-021: Consulta de citas por proveedor</w:t>
+      </w:r>
+    </w:p>
+    <w:p>
+      <w:pPr>
+        <w:pStyle w:val="ListBullet"/>
+      </w:pPr>
+      <w:r>
+        <w:t>Prioridad: Alta</w:t>
+      </w:r>
+    </w:p>
+    <w:p>
+      <w:pPr>
+        <w:pStyle w:val="ListBullet"/>
+      </w:pPr>
+      <w:r>
         <w:t>Actores: Proveedor</w:t>
       </w:r>
     </w:p>
@@ -1424,7 +1488,7 @@
         <w:pStyle w:val="Heading3"/>
       </w:pPr>
       <w:r>
-        <w:t>RF-021: Consulta operativa de citas</w:t>
+        <w:t>RF-022: Consulta operativa de citas</w:t>
       </w:r>
     </w:p>
     <w:p>
@@ -1464,7 +1528,7 @@
         <w:pStyle w:val="Heading3"/>
       </w:pPr>
       <w:r>
-        <w:t>RF-022: Creación de cita por Admin</w:t>
+        <w:t>RF-023: Creación de cita por Admin</w:t>
       </w:r>
     </w:p>
     <w:p>
@@ -1504,7 +1568,7 @@
         <w:pStyle w:val="Heading3"/>
       </w:pPr>
       <w:r>
-        <w:t>RF-023: Actualización de cita</w:t>
+        <w:t>RF-024: Actualización de cita</w:t>
       </w:r>
     </w:p>
     <w:p>
@@ -1544,7 +1608,7 @@
         <w:pStyle w:val="Heading3"/>
       </w:pPr>
       <w:r>
-        <w:t>RF-024: Eliminación de cita</w:t>
+        <w:t>RF-025: Eliminación de cita</w:t>
       </w:r>
     </w:p>
     <w:p>
@@ -1584,7 +1648,7 @@
         <w:pStyle w:val="Heading3"/>
       </w:pPr>
       <w:r>
-        <w:t>RF-025: Cambio de estado</w:t>
+        <w:t>RF-026: Cambio de estado</w:t>
       </w:r>
     </w:p>
     <w:p>
@@ -1624,7 +1688,7 @@
         <w:pStyle w:val="Heading3"/>
       </w:pPr>
       <w:r>
-        <w:t>RF-026: Extensión de duración</w:t>
+        <w:t>RF-027: Extensión de duración</w:t>
       </w:r>
     </w:p>
     <w:p>
@@ -1664,7 +1728,7 @@
         <w:pStyle w:val="Heading3"/>
       </w:pPr>
       <w:r>
-        <w:t>RF-027: Reprogramación</w:t>
+        <w:t>RF-028: Reprogramación</w:t>
       </w:r>
     </w:p>
     <w:p>
@@ -1704,7 +1768,7 @@
         <w:pStyle w:val="Heading3"/>
       </w:pPr>
       <w:r>
-        <w:t>RF-028: Cancelación por proveedor</w:t>
+        <w:t>RF-029: Cancelación por proveedor</w:t>
       </w:r>
     </w:p>
     <w:p>
@@ -1744,7 +1808,7 @@
         <w:pStyle w:val="Heading3"/>
       </w:pPr>
       <w:r>
-        <w:t>RF-029: Verificación de conflicto</w:t>
+        <w:t>RF-030: Verificación de conflicto</w:t>
       </w:r>
     </w:p>
     <w:p>
@@ -1768,7 +1832,7 @@
         <w:pStyle w:val="ListBullet"/>
       </w:pPr>
       <w:r>
-        <w:t>Descripción: Antes de confirmar horario, el sistema indica si existe solapamiento con otra cita del mismo proveedor.</w:t>
+        <w:t>Descripción: Antes de confirmar horario, el sistema indica si existe solapamiento con otra cita en la misma bodega y ventana.</w:t>
       </w:r>
     </w:p>
     <w:p>
@@ -1784,7 +1848,7 @@
         <w:pStyle w:val="Heading3"/>
       </w:pPr>
       <w:r>
-        <w:t>RF-030: Consulta de cupos disponibles</w:t>
+        <w:t>RF-031: Consulta de cupos disponibles</w:t>
       </w:r>
     </w:p>
     <w:p>
@@ -1808,7 +1872,7 @@
         <w:pStyle w:val="ListBullet"/>
       </w:pPr>
       <w:r>
-        <w:t>Descripción: El sistema calcula franjas disponibles para una fecha y proveedor según configuración y citas existentes.</w:t>
+        <w:t>Descripción: El sistema calcula franjas disponibles para una fecha, bodega y proveedor según configuración y citas existentes.</w:t>
       </w:r>
     </w:p>
     <w:p>
@@ -1824,7 +1888,7 @@
         <w:pStyle w:val="Heading3"/>
       </w:pPr>
       <w:r>
-        <w:t>RF-031: Exportación de citas</w:t>
+        <w:t>RF-032: Exportación de citas</w:t>
       </w:r>
     </w:p>
     <w:p>
@@ -1864,7 +1928,7 @@
         <w:pStyle w:val="Heading3"/>
       </w:pPr>
       <w:r>
-        <w:t>RF-032: Finalización automática</w:t>
+        <w:t>RF-033: Finalización automática</w:t>
       </w:r>
     </w:p>
     <w:p>
@@ -1912,7 +1976,7 @@
         <w:pStyle w:val="Heading3"/>
       </w:pPr>
       <w:r>
-        <w:t>RF-033: Consulta de franjas</w:t>
+        <w:t>RF-034: Consulta de franjas</w:t>
       </w:r>
     </w:p>
     <w:p>
@@ -1952,7 +2016,7 @@
         <w:pStyle w:val="Heading3"/>
       </w:pPr>
       <w:r>
-        <w:t>RF-034: Franjas resueltas por fecha</w:t>
+        <w:t>RF-035: Franjas resueltas por fecha</w:t>
       </w:r>
     </w:p>
     <w:p>
@@ -1992,7 +2056,7 @@
         <w:pStyle w:val="Heading3"/>
       </w:pPr>
       <w:r>
-        <w:t>RF-035: Configuración de franjas semanales</w:t>
+        <w:t>RF-036: Configuración de franjas semanales</w:t>
       </w:r>
     </w:p>
     <w:p>
@@ -2016,7 +2080,7 @@
         <w:pStyle w:val="ListBullet"/>
       </w:pPr>
       <w:r>
-        <w:t>Descripción: Admin define o actualiza intervalos permitidos por día de la semana.</w:t>
+        <w:t>Descripción: Admin define o actualiza intervalos permitidos por día de la semana y por bodega.</w:t>
       </w:r>
     </w:p>
     <w:p>
@@ -2032,7 +2096,7 @@
         <w:pStyle w:val="Heading3"/>
       </w:pPr>
       <w:r>
-        <w:t>RF-036: Excepciones por fecha</w:t>
+        <w:t>RF-037: Excepciones por fecha</w:t>
       </w:r>
     </w:p>
     <w:p>
@@ -2056,7 +2120,7 @@
         <w:pStyle w:val="ListBullet"/>
       </w:pPr>
       <w:r>
-        <w:t>Descripción: Admin configura franjas o cierres específicos para fechas puntuales (festivos, mantenimiento).</w:t>
+        <w:t>Descripción: Admin configura franjas o cierres específicos para fechas puntuales y bodega (festivos, mantenimiento).</w:t>
       </w:r>
     </w:p>
     <w:p>
@@ -2072,7 +2136,7 @@
         <w:pStyle w:val="Heading3"/>
       </w:pPr>
       <w:r>
-        <w:t>RF-037: Resumen de disponibilidad por fecha</w:t>
+        <w:t>RF-038: Resumen de disponibilidad por fecha</w:t>
       </w:r>
     </w:p>
     <w:p>
@@ -2120,7 +2184,7 @@
         <w:pStyle w:val="Heading3"/>
       </w:pPr>
       <w:r>
-        <w:t>RF-038: Perfil propio</w:t>
+        <w:t>RF-039: Perfil propio</w:t>
       </w:r>
     </w:p>
     <w:p>
@@ -2160,7 +2224,7 @@
         <w:pStyle w:val="Heading3"/>
       </w:pPr>
       <w:r>
-        <w:t>RF-039: Foto de perfil</w:t>
+        <w:t>RF-040: Foto de perfil</w:t>
       </w:r>
     </w:p>
     <w:p>
@@ -2200,7 +2264,7 @@
         <w:pStyle w:val="Heading3"/>
       </w:pPr>
       <w:r>
-        <w:t>RF-040: Centro de notificaciones</w:t>
+        <w:t>RF-041: Centro de notificaciones</w:t>
       </w:r>
     </w:p>
     <w:p>
@@ -2240,7 +2304,7 @@
         <w:pStyle w:val="Heading3"/>
       </w:pPr>
       <w:r>
-        <w:t>RF-041: Recordatorios de cita</w:t>
+        <w:t>RF-042: Recordatorios de cita</w:t>
       </w:r>
     </w:p>
     <w:p>
@@ -2280,7 +2344,7 @@
         <w:pStyle w:val="Heading3"/>
       </w:pPr>
       <w:r>
-        <w:t>RF-042: Historial de cambios</w:t>
+        <w:t>RF-043: Historial de cambios</w:t>
       </w:r>
     </w:p>
     <w:p>
@@ -2320,7 +2384,7 @@
         <w:pStyle w:val="Heading3"/>
       </w:pPr>
       <w:r>
-        <w:t>RF-043: Auditoría de administración</w:t>
+        <w:t>RF-044: Auditoría de administración</w:t>
       </w:r>
     </w:p>
     <w:p>
@@ -2360,7 +2424,7 @@
         <w:pStyle w:val="Heading3"/>
       </w:pPr>
       <w:r>
-        <w:t>RF-044: Auditoría de accesos</w:t>
+        <w:t>RF-045: Auditoría de accesos</w:t>
       </w:r>
     </w:p>
     <w:p>
@@ -2408,7 +2472,7 @@
         <w:pStyle w:val="Heading3"/>
       </w:pPr>
       <w:r>
-        <w:t>RF-045: Página de inicio y acceso</w:t>
+        <w:t>RF-046: Página de inicio y acceso</w:t>
       </w:r>
     </w:p>
     <w:p>
@@ -2448,7 +2512,7 @@
         <w:pStyle w:val="Heading3"/>
       </w:pPr>
       <w:r>
-        <w:t>RF-046: Panel por rol</w:t>
+        <w:t>RF-047: Panel por rol</w:t>
       </w:r>
     </w:p>
     <w:p>
@@ -2488,7 +2552,7 @@
         <w:pStyle w:val="Heading3"/>
       </w:pPr>
       <w:r>
-        <w:t>RF-047: Tema claro y oscuro</w:t>
+        <w:t>RF-048: Tema claro y oscuro</w:t>
       </w:r>
     </w:p>
     <w:p>
@@ -2528,7 +2592,7 @@
         <w:pStyle w:val="Heading3"/>
       </w:pPr>
       <w:r>
-        <w:t>RF-048: Tour guiado</w:t>
+        <w:t>RF-049: Tour guiado</w:t>
       </w:r>
     </w:p>
     <w:p>
@@ -2568,7 +2632,7 @@
         <w:pStyle w:val="Heading3"/>
       </w:pPr>
       <w:r>
-        <w:t>RF-049: Mensajes de error de API</w:t>
+        <w:t>RF-050: Mensajes de error de API</w:t>
       </w:r>
     </w:p>
     <w:p>
@@ -2608,7 +2672,7 @@
         <w:pStyle w:val="Heading3"/>
       </w:pPr>
       <w:r>
-        <w:t>RF-050: Renovación silenciosa de token</w:t>
+        <w:t>RF-051: Renovación silenciosa de token</w:t>
       </w:r>
     </w:p>
     <w:p>
@@ -2633,6 +2697,46 @@
       </w:pPr>
       <w:r>
         <w:t>Descripción: Ante expiración del token de acceso, el cliente solicita renovación automática usando la cookie de actualización.</w:t>
+      </w:r>
+    </w:p>
+    <w:p>
+      <w:pPr>
+        <w:pStyle w:val="ListBullet"/>
+      </w:pPr>
+      <w:r>
+        <w:t>Procesamiento: Validación en API, persistencia en PostgreSQL, respuesta JSON estándar.</w:t>
+      </w:r>
+    </w:p>
+    <w:p>
+      <w:pPr>
+        <w:pStyle w:val="Heading3"/>
+      </w:pPr>
+      <w:r>
+        <w:t>RF-052: Despertar API en producción</w:t>
+      </w:r>
+    </w:p>
+    <w:p>
+      <w:pPr>
+        <w:pStyle w:val="ListBullet"/>
+      </w:pPr>
+      <w:r>
+        <w:t>Prioridad: Media</w:t>
+      </w:r>
+    </w:p>
+    <w:p>
+      <w:pPr>
+        <w:pStyle w:val="ListBullet"/>
+      </w:pPr>
+      <w:r>
+        <w:t>Actores: Proveedor, Admin, Logística</w:t>
+      </w:r>
+    </w:p>
+    <w:p>
+      <w:pPr>
+        <w:pStyle w:val="ListBullet"/>
+      </w:pPr>
+      <w:r>
+        <w:t>Descripción: Ante hosting con suspensión por inactividad, el cliente puede solicitar /health antes del login para reducir timeouts.</w:t>
       </w:r>
     </w:p>
     <w:p>
@@ -3417,7 +3521,7 @@
           </w:tcPr>
           <w:p>
             <w:r>
-              <w:t>19/05/2026</w:t>
+              <w:t>21/05/2026</w:t>
             </w:r>
           </w:p>
         </w:tc>
@@ -3438,6 +3542,48 @@
           <w:p>
             <w:r>
               <w:t>Emisión inicial de la especificación IEEE 830.</w:t>
+            </w:r>
+          </w:p>
+        </w:tc>
+      </w:tr>
+      <w:tr>
+        <w:tc>
+          <w:tcPr>
+            <w:tcW w:type="dxa" w:w="2280"/>
+          </w:tcPr>
+          <w:p>
+            <w:r>
+              <w:t>1.1</w:t>
+            </w:r>
+          </w:p>
+        </w:tc>
+        <w:tc>
+          <w:tcPr>
+            <w:tcW w:type="dxa" w:w="2280"/>
+          </w:tcPr>
+          <w:p>
+            <w:r>
+              <w:t>21/05/2026</w:t>
+            </w:r>
+          </w:p>
+        </w:tc>
+        <w:tc>
+          <w:tcPr>
+            <w:tcW w:type="dxa" w:w="2280"/>
+          </w:tcPr>
+          <w:p>
+            <w:r>
+              <w:t>Equipo Ferragro</w:t>
+            </w:r>
+          </w:p>
+        </w:tc>
+        <w:tc>
+          <w:tcPr>
+            <w:tcW w:type="dxa" w:w="2280"/>
+          </w:tcPr>
+          <w:p>
+            <w:r>
+              <w:t>Bodegas obligatorias en citas, franjas por bodega, citas_create con IdBodega, índices 015.</w:t>
             </w:r>
           </w:p>
         </w:tc>

</xml_diff>